<commit_message>
Updated the Release Notes document per the review comments.
</commit_message>
<xml_diff>
--- a/site/downloads/Shared Components/IVI.NET Shared Components Release Notes_3.1.8927.docx
+++ b/site/downloads/Shared Components/IVI.NET Shared Components Release Notes_3.1.8927.docx
@@ -49,10 +49,9 @@
       <w:pPr>
         <w:pStyle w:val="TOC3"/>
         <w:rPr>
-          <w:rFonts w:asciiTheme="minorHAnsi" w:eastAsiaTheme="minorEastAsia" w:hAnsiTheme="minorHAnsi" w:cstheme="minorBidi"/>
+          <w:rFonts w:ascii="Calibri" w:hAnsi="Calibri" w:cs="Arial"/>
           <w:b w:val="0"/>
           <w:kern w:val="2"/>
-          <w14:ligatures w14:val="standardContextual"/>
         </w:rPr>
       </w:pPr>
       <w:r>
@@ -127,10 +126,9 @@
       <w:pPr>
         <w:pStyle w:val="TOC3"/>
         <w:rPr>
-          <w:rFonts w:asciiTheme="minorHAnsi" w:eastAsiaTheme="minorEastAsia" w:hAnsiTheme="minorHAnsi" w:cstheme="minorBidi"/>
+          <w:rFonts w:ascii="Calibri" w:hAnsi="Calibri" w:cs="Arial"/>
           <w:b w:val="0"/>
           <w:kern w:val="2"/>
-          <w14:ligatures w14:val="standardContextual"/>
         </w:rPr>
       </w:pPr>
       <w:hyperlink w:anchor="_Toc236139460" w:history="1">
@@ -190,10 +188,9 @@
           <w:tab w:val="right" w:leader="dot" w:pos="8630"/>
         </w:tabs>
         <w:rPr>
-          <w:rFonts w:asciiTheme="minorHAnsi" w:eastAsiaTheme="minorEastAsia" w:hAnsiTheme="minorHAnsi" w:cstheme="minorBidi"/>
+          <w:rFonts w:ascii="Calibri" w:hAnsi="Calibri" w:cs="Arial"/>
           <w:noProof/>
           <w:kern w:val="2"/>
-          <w14:ligatures w14:val="standardContextual"/>
         </w:rPr>
       </w:pPr>
       <w:hyperlink w:anchor="_Toc236139461" w:history="1">
@@ -261,10 +258,9 @@
           <w:tab w:val="right" w:leader="dot" w:pos="8630"/>
         </w:tabs>
         <w:rPr>
-          <w:rFonts w:asciiTheme="minorHAnsi" w:eastAsiaTheme="minorEastAsia" w:hAnsiTheme="minorHAnsi" w:cstheme="minorBidi"/>
+          <w:rFonts w:ascii="Calibri" w:hAnsi="Calibri" w:cs="Arial"/>
           <w:noProof/>
           <w:kern w:val="2"/>
-          <w14:ligatures w14:val="standardContextual"/>
         </w:rPr>
       </w:pPr>
       <w:hyperlink w:anchor="_Toc236139462" w:history="1">
@@ -332,10 +328,9 @@
           <w:tab w:val="right" w:leader="dot" w:pos="8630"/>
         </w:tabs>
         <w:rPr>
-          <w:rFonts w:asciiTheme="minorHAnsi" w:eastAsiaTheme="minorEastAsia" w:hAnsiTheme="minorHAnsi" w:cstheme="minorBidi"/>
+          <w:rFonts w:ascii="Calibri" w:hAnsi="Calibri" w:cs="Arial"/>
           <w:noProof/>
           <w:kern w:val="2"/>
-          <w14:ligatures w14:val="standardContextual"/>
         </w:rPr>
       </w:pPr>
       <w:hyperlink w:anchor="_Toc236139463" w:history="1">
@@ -403,10 +398,9 @@
           <w:tab w:val="right" w:leader="dot" w:pos="8630"/>
         </w:tabs>
         <w:rPr>
-          <w:rFonts w:asciiTheme="minorHAnsi" w:eastAsiaTheme="minorEastAsia" w:hAnsiTheme="minorHAnsi" w:cstheme="minorBidi"/>
+          <w:rFonts w:ascii="Calibri" w:hAnsi="Calibri" w:cs="Arial"/>
           <w:noProof/>
           <w:kern w:val="2"/>
-          <w14:ligatures w14:val="standardContextual"/>
         </w:rPr>
       </w:pPr>
       <w:hyperlink w:anchor="_Toc236139464" w:history="1">
@@ -474,10 +468,9 @@
           <w:tab w:val="right" w:leader="dot" w:pos="8630"/>
         </w:tabs>
         <w:rPr>
-          <w:rFonts w:asciiTheme="minorHAnsi" w:eastAsiaTheme="minorEastAsia" w:hAnsiTheme="minorHAnsi" w:cstheme="minorBidi"/>
+          <w:rFonts w:ascii="Calibri" w:hAnsi="Calibri" w:cs="Arial"/>
           <w:noProof/>
           <w:kern w:val="2"/>
-          <w14:ligatures w14:val="standardContextual"/>
         </w:rPr>
       </w:pPr>
       <w:hyperlink w:anchor="_Toc236139465" w:history="1">
@@ -545,10 +538,9 @@
           <w:tab w:val="right" w:leader="dot" w:pos="8630"/>
         </w:tabs>
         <w:rPr>
-          <w:rFonts w:asciiTheme="minorHAnsi" w:eastAsiaTheme="minorEastAsia" w:hAnsiTheme="minorHAnsi" w:cstheme="minorBidi"/>
+          <w:rFonts w:ascii="Calibri" w:hAnsi="Calibri" w:cs="Arial"/>
           <w:noProof/>
           <w:kern w:val="2"/>
-          <w14:ligatures w14:val="standardContextual"/>
         </w:rPr>
       </w:pPr>
       <w:hyperlink w:anchor="_Toc236139466" w:history="1">
@@ -616,10 +608,9 @@
           <w:tab w:val="right" w:leader="dot" w:pos="8630"/>
         </w:tabs>
         <w:rPr>
-          <w:rFonts w:asciiTheme="minorHAnsi" w:eastAsiaTheme="minorEastAsia" w:hAnsiTheme="minorHAnsi" w:cstheme="minorBidi"/>
+          <w:rFonts w:ascii="Calibri" w:hAnsi="Calibri" w:cs="Arial"/>
           <w:noProof/>
           <w:kern w:val="2"/>
-          <w14:ligatures w14:val="standardContextual"/>
         </w:rPr>
       </w:pPr>
       <w:hyperlink w:anchor="_Toc236139467" w:history="1">
@@ -687,10 +678,9 @@
           <w:tab w:val="right" w:leader="dot" w:pos="8630"/>
         </w:tabs>
         <w:rPr>
-          <w:rFonts w:asciiTheme="minorHAnsi" w:eastAsiaTheme="minorEastAsia" w:hAnsiTheme="minorHAnsi" w:cstheme="minorBidi"/>
+          <w:rFonts w:ascii="Calibri" w:hAnsi="Calibri" w:cs="Arial"/>
           <w:noProof/>
           <w:kern w:val="2"/>
-          <w14:ligatures w14:val="standardContextual"/>
         </w:rPr>
       </w:pPr>
       <w:hyperlink w:anchor="_Toc236139468" w:history="1">
@@ -758,10 +748,9 @@
           <w:tab w:val="right" w:leader="dot" w:pos="8630"/>
         </w:tabs>
         <w:rPr>
-          <w:rFonts w:asciiTheme="minorHAnsi" w:eastAsiaTheme="minorEastAsia" w:hAnsiTheme="minorHAnsi" w:cstheme="minorBidi"/>
+          <w:rFonts w:ascii="Calibri" w:hAnsi="Calibri" w:cs="Arial"/>
           <w:noProof/>
           <w:kern w:val="2"/>
-          <w14:ligatures w14:val="standardContextual"/>
         </w:rPr>
       </w:pPr>
       <w:hyperlink w:anchor="_Toc236139469" w:history="1">
@@ -829,10 +818,9 @@
           <w:tab w:val="right" w:leader="dot" w:pos="8630"/>
         </w:tabs>
         <w:rPr>
-          <w:rFonts w:asciiTheme="minorHAnsi" w:eastAsiaTheme="minorEastAsia" w:hAnsiTheme="minorHAnsi" w:cstheme="minorBidi"/>
+          <w:rFonts w:ascii="Calibri" w:hAnsi="Calibri" w:cs="Arial"/>
           <w:noProof/>
           <w:kern w:val="2"/>
-          <w14:ligatures w14:val="standardContextual"/>
         </w:rPr>
       </w:pPr>
       <w:hyperlink w:anchor="_Toc236139470" w:history="1">
@@ -900,10 +888,9 @@
           <w:tab w:val="right" w:leader="dot" w:pos="8630"/>
         </w:tabs>
         <w:rPr>
-          <w:rFonts w:asciiTheme="minorHAnsi" w:eastAsiaTheme="minorEastAsia" w:hAnsiTheme="minorHAnsi" w:cstheme="minorBidi"/>
+          <w:rFonts w:ascii="Calibri" w:hAnsi="Calibri" w:cs="Arial"/>
           <w:noProof/>
           <w:kern w:val="2"/>
-          <w14:ligatures w14:val="standardContextual"/>
         </w:rPr>
       </w:pPr>
       <w:hyperlink w:anchor="_Toc236139471" w:history="1">
@@ -971,10 +958,9 @@
           <w:tab w:val="right" w:leader="dot" w:pos="8630"/>
         </w:tabs>
         <w:rPr>
-          <w:rFonts w:asciiTheme="minorHAnsi" w:eastAsiaTheme="minorEastAsia" w:hAnsiTheme="minorHAnsi" w:cstheme="minorBidi"/>
+          <w:rFonts w:ascii="Calibri" w:hAnsi="Calibri" w:cs="Arial"/>
           <w:noProof/>
           <w:kern w:val="2"/>
-          <w14:ligatures w14:val="standardContextual"/>
         </w:rPr>
       </w:pPr>
       <w:hyperlink w:anchor="_Toc236139472" w:history="1">
@@ -1042,10 +1028,9 @@
           <w:tab w:val="right" w:leader="dot" w:pos="8630"/>
         </w:tabs>
         <w:rPr>
-          <w:rFonts w:asciiTheme="minorHAnsi" w:eastAsiaTheme="minorEastAsia" w:hAnsiTheme="minorHAnsi" w:cstheme="minorBidi"/>
+          <w:rFonts w:ascii="Calibri" w:hAnsi="Calibri" w:cs="Arial"/>
           <w:noProof/>
           <w:kern w:val="2"/>
-          <w14:ligatures w14:val="standardContextual"/>
         </w:rPr>
       </w:pPr>
       <w:hyperlink w:anchor="_Toc236139473" w:history="1">
@@ -1113,10 +1098,9 @@
           <w:tab w:val="right" w:leader="dot" w:pos="8630"/>
         </w:tabs>
         <w:rPr>
-          <w:rFonts w:asciiTheme="minorHAnsi" w:eastAsiaTheme="minorEastAsia" w:hAnsiTheme="minorHAnsi" w:cstheme="minorBidi"/>
+          <w:rFonts w:ascii="Calibri" w:hAnsi="Calibri" w:cs="Arial"/>
           <w:noProof/>
           <w:kern w:val="2"/>
-          <w14:ligatures w14:val="standardContextual"/>
         </w:rPr>
       </w:pPr>
       <w:hyperlink w:anchor="_Toc236139474" w:history="1">
@@ -1184,10 +1168,9 @@
           <w:tab w:val="right" w:leader="dot" w:pos="8630"/>
         </w:tabs>
         <w:rPr>
-          <w:rFonts w:asciiTheme="minorHAnsi" w:eastAsiaTheme="minorEastAsia" w:hAnsiTheme="minorHAnsi" w:cstheme="minorBidi"/>
+          <w:rFonts w:ascii="Calibri" w:hAnsi="Calibri" w:cs="Arial"/>
           <w:noProof/>
           <w:kern w:val="2"/>
-          <w14:ligatures w14:val="standardContextual"/>
         </w:rPr>
       </w:pPr>
       <w:hyperlink w:anchor="_Toc236139475" w:history="1">
@@ -1255,10 +1238,9 @@
           <w:tab w:val="right" w:leader="dot" w:pos="8630"/>
         </w:tabs>
         <w:rPr>
-          <w:rFonts w:asciiTheme="minorHAnsi" w:eastAsiaTheme="minorEastAsia" w:hAnsiTheme="minorHAnsi" w:cstheme="minorBidi"/>
+          <w:rFonts w:ascii="Calibri" w:hAnsi="Calibri" w:cs="Arial"/>
           <w:noProof/>
           <w:kern w:val="2"/>
-          <w14:ligatures w14:val="standardContextual"/>
         </w:rPr>
       </w:pPr>
       <w:hyperlink w:anchor="_Toc236139476" w:history="1">
@@ -1326,10 +1308,9 @@
           <w:tab w:val="right" w:leader="dot" w:pos="8630"/>
         </w:tabs>
         <w:rPr>
-          <w:rFonts w:asciiTheme="minorHAnsi" w:eastAsiaTheme="minorEastAsia" w:hAnsiTheme="minorHAnsi" w:cstheme="minorBidi"/>
+          <w:rFonts w:ascii="Calibri" w:hAnsi="Calibri" w:cs="Arial"/>
           <w:noProof/>
           <w:kern w:val="2"/>
-          <w14:ligatures w14:val="standardContextual"/>
         </w:rPr>
       </w:pPr>
       <w:hyperlink w:anchor="_Toc236139477" w:history="1">
@@ -1397,10 +1378,9 @@
           <w:tab w:val="right" w:leader="dot" w:pos="8630"/>
         </w:tabs>
         <w:rPr>
-          <w:rFonts w:asciiTheme="minorHAnsi" w:eastAsiaTheme="minorEastAsia" w:hAnsiTheme="minorHAnsi" w:cstheme="minorBidi"/>
+          <w:rFonts w:ascii="Calibri" w:hAnsi="Calibri" w:cs="Arial"/>
           <w:noProof/>
           <w:kern w:val="2"/>
-          <w14:ligatures w14:val="standardContextual"/>
         </w:rPr>
       </w:pPr>
       <w:hyperlink w:anchor="_Toc236139478" w:history="1">
@@ -1465,10 +1445,9 @@
       <w:pPr>
         <w:pStyle w:val="TOC3"/>
         <w:rPr>
-          <w:rFonts w:asciiTheme="minorHAnsi" w:eastAsiaTheme="minorEastAsia" w:hAnsiTheme="minorHAnsi" w:cstheme="minorBidi"/>
+          <w:rFonts w:ascii="Calibri" w:hAnsi="Calibri" w:cs="Arial"/>
           <w:b w:val="0"/>
           <w:kern w:val="2"/>
-          <w14:ligatures w14:val="standardContextual"/>
         </w:rPr>
       </w:pPr>
       <w:hyperlink w:anchor="_Toc236139479" w:history="1">
@@ -5142,20 +5121,17 @@
     </w:p>
     <w:p>
       <w:pPr>
-        <w:pStyle w:val="ListParagraph"/>
         <w:numPr>
           <w:ilvl w:val="0"/>
           <w:numId w:val="28"/>
         </w:numPr>
         <w:rPr>
-          <w:rFonts w:ascii="Times New Roman" w:eastAsia="Times New Roman" w:hAnsi="Times New Roman" w:cs="Times New Roman"/>
-          <w:sz w:val="20"/>
-          <w:szCs w:val="20"/>
-        </w:rPr>
-      </w:pPr>
-      <w:r>
-        <w:rPr>
-          <w:rFonts w:ascii="Times New Roman" w:eastAsia="Times New Roman" w:hAnsi="Times New Roman" w:cs="Times New Roman"/>
+          <w:sz w:val="20"/>
+          <w:szCs w:val="20"/>
+        </w:rPr>
+      </w:pPr>
+      <w:r>
+        <w:rPr>
           <w:sz w:val="20"/>
           <w:szCs w:val="20"/>
         </w:rPr>
@@ -5164,7 +5140,6 @@
       <w:proofErr w:type="spellStart"/>
       <w:r>
         <w:rPr>
-          <w:rFonts w:ascii="Times New Roman" w:eastAsia="Times New Roman" w:hAnsi="Times New Roman" w:cs="Times New Roman"/>
           <w:sz w:val="20"/>
           <w:szCs w:val="20"/>
         </w:rPr>
@@ -5173,45 +5148,22 @@
       <w:proofErr w:type="spellEnd"/>
       <w:r>
         <w:rPr>
-          <w:rFonts w:ascii="Times New Roman" w:eastAsia="Times New Roman" w:hAnsi="Times New Roman" w:cs="Times New Roman"/>
-          <w:sz w:val="20"/>
-          <w:szCs w:val="20"/>
-        </w:rPr>
-        <w:t xml:space="preserve"> GUID in </w:t>
+          <w:sz w:val="20"/>
+          <w:szCs w:val="20"/>
+        </w:rPr>
+        <w:t xml:space="preserve"> to support side-by-side (</w:t>
       </w:r>
       <w:proofErr w:type="spellStart"/>
-      <w:proofErr w:type="gramStart"/>
-      <w:r>
-        <w:rPr>
-          <w:rFonts w:ascii="Times New Roman" w:eastAsia="Times New Roman" w:hAnsi="Times New Roman" w:cs="Times New Roman"/>
-          <w:sz w:val="20"/>
-          <w:szCs w:val="20"/>
-        </w:rPr>
-        <w:t>Ivi.Wix.Props</w:t>
+      <w:r>
+        <w:rPr>
+          <w:sz w:val="20"/>
+          <w:szCs w:val="20"/>
+        </w:rPr>
+        <w:t>SxS</w:t>
       </w:r>
       <w:proofErr w:type="spellEnd"/>
-      <w:proofErr w:type="gramEnd"/>
-      <w:r>
-        <w:rPr>
-          <w:rFonts w:ascii="Times New Roman" w:eastAsia="Times New Roman" w:hAnsi="Times New Roman" w:cs="Times New Roman"/>
-          <w:sz w:val="20"/>
-          <w:szCs w:val="20"/>
-        </w:rPr>
-        <w:t xml:space="preserve"> to support side-by-side (</w:t>
-      </w:r>
-      <w:proofErr w:type="spellStart"/>
-      <w:r>
-        <w:rPr>
-          <w:rFonts w:ascii="Times New Roman" w:eastAsia="Times New Roman" w:hAnsi="Times New Roman" w:cs="Times New Roman"/>
-          <w:sz w:val="20"/>
-          <w:szCs w:val="20"/>
-        </w:rPr>
-        <w:t>SxS</w:t>
-      </w:r>
-      <w:proofErr w:type="spellEnd"/>
-      <w:r>
-        <w:rPr>
-          <w:rFonts w:ascii="Times New Roman" w:eastAsia="Times New Roman" w:hAnsi="Times New Roman" w:cs="Times New Roman"/>
+      <w:r>
+        <w:rPr>
           <w:sz w:val="20"/>
           <w:szCs w:val="20"/>
         </w:rPr>
@@ -9057,21 +9009,6 @@
 </file>
 
 <file path=customXml/item1.xml><?xml version="1.0" encoding="utf-8"?>
-<?mso-contentType ?>
-<FormTemplates xmlns="http://schemas.microsoft.com/sharepoint/v3/contenttype/forms">
-  <Display>DocumentLibraryForm</Display>
-  <Edit>DocumentLibraryForm</Edit>
-  <New>DocumentLibraryForm</New>
-</FormTemplates>
-</file>
-
-<file path=customXml/item2.xml><?xml version="1.0" encoding="utf-8"?>
-<p:properties xmlns:p="http://schemas.microsoft.com/office/2006/metadata/properties" xmlns:xsi="http://www.w3.org/2001/XMLSchema-instance" xmlns:pc="http://schemas.microsoft.com/office/infopath/2007/PartnerControls">
-  <documentManagement/>
-</p:properties>
-</file>
-
-<file path=customXml/item3.xml><?xml version="1.0" encoding="utf-8"?>
 <ct:contentTypeSchema xmlns:ct="http://schemas.microsoft.com/office/2006/metadata/contentType" xmlns:ma="http://schemas.microsoft.com/office/2006/metadata/properties/metaAttributes" ct:_="" ma:_="" ma:contentTypeName="Document" ma:contentTypeID="0x010100537DA307C0E5184C97D998360D3C580D" ma:contentTypeVersion="6" ma:contentTypeDescription="Create a new document." ma:contentTypeScope="" ma:versionID="7ca8487c9bc84888196652b7e4dce53d">
   <xsd:schema xmlns:xsd="http://www.w3.org/2001/XMLSchema" xmlns:xs="http://www.w3.org/2001/XMLSchema" xmlns:p="http://schemas.microsoft.com/office/2006/metadata/properties" xmlns:ns2="640d2263-2e82-4d51-a3e1-49d6696a6352" xmlns:ns3="4788b6bb-b214-41e3-b910-ec68c8d3ee95" targetNamespace="http://schemas.microsoft.com/office/2006/metadata/properties" ma:root="true" ma:fieldsID="13583af2acf8f80b746ca1e389e40ef8" ns2:_="" ns3:_="">
     <xsd:import namespace="640d2263-2e82-4d51-a3e1-49d6696a6352"/>
@@ -9250,24 +9187,22 @@
 </ct:contentTypeSchema>
 </file>
 
-<file path=customXml/itemProps1.xml><?xml version="1.0" encoding="utf-8"?>
-<ds:datastoreItem xmlns:ds="http://schemas.openxmlformats.org/officeDocument/2006/customXml" ds:itemID="{91D255AD-031A-45E9-A390-462BD58F2665}">
-  <ds:schemaRefs>
-    <ds:schemaRef ds:uri="http://schemas.microsoft.com/sharepoint/v3/contenttype/forms"/>
-  </ds:schemaRefs>
-</ds:datastoreItem>
+<file path=customXml/item2.xml><?xml version="1.0" encoding="utf-8"?>
+<p:properties xmlns:p="http://schemas.microsoft.com/office/2006/metadata/properties" xmlns:xsi="http://www.w3.org/2001/XMLSchema-instance" xmlns:pc="http://schemas.microsoft.com/office/infopath/2007/PartnerControls">
+  <documentManagement/>
+</p:properties>
 </file>
 
-<file path=customXml/itemProps2.xml><?xml version="1.0" encoding="utf-8"?>
-<ds:datastoreItem xmlns:ds="http://schemas.openxmlformats.org/officeDocument/2006/customXml" ds:itemID="{4197C08C-6CB0-4887-896D-29AA52CDD034}">
-  <ds:schemaRefs>
-    <ds:schemaRef ds:uri="http://schemas.microsoft.com/office/2006/metadata/properties"/>
-    <ds:schemaRef ds:uri="http://schemas.microsoft.com/office/infopath/2007/PartnerControls"/>
-  </ds:schemaRefs>
-</ds:datastoreItem>
+<file path=customXml/item3.xml><?xml version="1.0" encoding="utf-8"?>
+<?mso-contentType ?>
+<FormTemplates xmlns="http://schemas.microsoft.com/sharepoint/v3/contenttype/forms">
+  <Display>DocumentLibraryForm</Display>
+  <Edit>DocumentLibraryForm</Edit>
+  <New>DocumentLibraryForm</New>
+</FormTemplates>
 </file>
 
-<file path=customXml/itemProps3.xml><?xml version="1.0" encoding="utf-8"?>
+<file path=customXml/itemProps1.xml><?xml version="1.0" encoding="utf-8"?>
 <ds:datastoreItem xmlns:ds="http://schemas.openxmlformats.org/officeDocument/2006/customXml" ds:itemID="{8D25DC98-8B69-4DEB-99EA-EFE321D7D9A6}">
   <ds:schemaRefs>
     <ds:schemaRef ds:uri="http://schemas.microsoft.com/office/2006/metadata/contentType"/>
@@ -9286,6 +9221,23 @@
 </ds:datastoreItem>
 </file>
 
+<file path=customXml/itemProps2.xml><?xml version="1.0" encoding="utf-8"?>
+<ds:datastoreItem xmlns:ds="http://schemas.openxmlformats.org/officeDocument/2006/customXml" ds:itemID="{4197C08C-6CB0-4887-896D-29AA52CDD034}">
+  <ds:schemaRefs>
+    <ds:schemaRef ds:uri="http://schemas.microsoft.com/office/2006/metadata/properties"/>
+    <ds:schemaRef ds:uri="http://schemas.microsoft.com/office/infopath/2007/PartnerControls"/>
+  </ds:schemaRefs>
+</ds:datastoreItem>
+</file>
+
+<file path=customXml/itemProps3.xml><?xml version="1.0" encoding="utf-8"?>
+<ds:datastoreItem xmlns:ds="http://schemas.openxmlformats.org/officeDocument/2006/customXml" ds:itemID="{91D255AD-031A-45E9-A390-462BD58F2665}">
+  <ds:schemaRefs>
+    <ds:schemaRef ds:uri="http://schemas.microsoft.com/sharepoint/v3/contenttype/forms"/>
+  </ds:schemaRefs>
+</ds:datastoreItem>
+</file>
+
 <file path=docMetadata/LabelInfo.xml><?xml version="1.0" encoding="utf-8"?>
 <clbl:labelList xmlns:clbl="http://schemas.microsoft.com/office/2020/mipLabelMetadata">
   <clbl:label id="{63545f27-3232-4d74-a44d-cdd457063402}" enabled="0" method="" siteId="{63545f27-3232-4d74-a44d-cdd457063402}" removed="1"/>

</xml_diff>